<commit_message>
updating changes for Assignment5
</commit_message>
<xml_diff>
--- a/Assignment5/CSC500 Module 5 - Critical Thinking Assignment.docx
+++ b/Assignment5/CSC500 Module 5 - Critical Thinking Assignment.docx
@@ -227,11 +227,9 @@
         <w:br/>
         <w:t xml:space="preserve">Set </w:t>
       </w:r>
-      <w:proofErr w:type="spellStart"/>
       <w:r>
         <w:t>total_inches_of_rainfall</w:t>
       </w:r>
-      <w:proofErr w:type="spellEnd"/>
       <w:r>
         <w:t xml:space="preserve"> </w:t>
       </w:r>
@@ -245,11 +243,9 @@
         <w:br/>
         <w:t xml:space="preserve">Set </w:t>
       </w:r>
-      <w:proofErr w:type="spellStart"/>
       <w:r>
         <w:t>total_months_count</w:t>
       </w:r>
-      <w:proofErr w:type="spellEnd"/>
       <w:r>
         <w:t xml:space="preserve"> </w:t>
       </w:r>
@@ -312,20 +308,16 @@
       <w:r>
         <w:t xml:space="preserve">to </w:t>
       </w:r>
-      <w:proofErr w:type="spellStart"/>
       <w:r>
         <w:t>total_inches_of_rainfall</w:t>
       </w:r>
-      <w:proofErr w:type="spellEnd"/>
       <w:r>
         <w:br/>
         <w:t xml:space="preserve">        Increment </w:t>
       </w:r>
-      <w:proofErr w:type="spellStart"/>
       <w:r>
         <w:t>total_months_count</w:t>
       </w:r>
-      <w:proofErr w:type="spellEnd"/>
       <w:r>
         <w:br/>
         <w:t xml:space="preserve">    End For</w:t>
@@ -341,57 +333,33 @@
         <w:br/>
         <w:t xml:space="preserve">Calculate </w:t>
       </w:r>
-      <w:proofErr w:type="spellStart"/>
+      <w:r>
+        <w:t>average_rainfall_in_inches = total_inches_of_rainfall / total_months_count</w:t>
+      </w:r>
+      <w:r>
+        <w:br/>
+      </w:r>
+      <w:r>
+        <w:br/>
+        <w:t xml:space="preserve">Display </w:t>
+      </w:r>
+      <w:r>
+        <w:t>total_months_count</w:t>
+      </w:r>
+      <w:r>
+        <w:br/>
+        <w:t xml:space="preserve">Display </w:t>
+      </w:r>
+      <w:r>
+        <w:t>total_inches_of_rainfall</w:t>
+      </w:r>
+      <w:r>
+        <w:br/>
+        <w:t xml:space="preserve">Display </w:t>
+      </w:r>
       <w:r>
         <w:t>average_rainfall_in_inches</w:t>
       </w:r>
-      <w:proofErr w:type="spellEnd"/>
-      <w:r>
-        <w:t xml:space="preserve"> = </w:t>
-      </w:r>
-      <w:proofErr w:type="spellStart"/>
-      <w:r>
-        <w:t>total_inches_of_rainfall</w:t>
-      </w:r>
-      <w:proofErr w:type="spellEnd"/>
-      <w:r>
-        <w:t xml:space="preserve"> / </w:t>
-      </w:r>
-      <w:proofErr w:type="spellStart"/>
-      <w:r>
-        <w:t>total_months_count</w:t>
-      </w:r>
-      <w:proofErr w:type="spellEnd"/>
-      <w:r>
-        <w:br/>
-      </w:r>
-      <w:r>
-        <w:br/>
-        <w:t xml:space="preserve">Display </w:t>
-      </w:r>
-      <w:proofErr w:type="spellStart"/>
-      <w:r>
-        <w:t>total_months_count</w:t>
-      </w:r>
-      <w:proofErr w:type="spellEnd"/>
-      <w:r>
-        <w:br/>
-        <w:t xml:space="preserve">Display </w:t>
-      </w:r>
-      <w:proofErr w:type="spellStart"/>
-      <w:r>
-        <w:t>total_inches_of_rainfall</w:t>
-      </w:r>
-      <w:proofErr w:type="spellEnd"/>
-      <w:r>
-        <w:br/>
-        <w:t xml:space="preserve">Display </w:t>
-      </w:r>
-      <w:proofErr w:type="spellStart"/>
-      <w:r>
-        <w:t>average_rainfall_in_inches</w:t>
-      </w:r>
-      <w:proofErr w:type="spellEnd"/>
       <w:r>
         <w:br/>
       </w:r>
@@ -576,40 +544,14 @@
           <w:rFonts w:ascii="Calibri" w:hAnsi="Calibri" w:cs="Calibri"/>
         </w:rPr>
         <w:br/>
-      </w:r>
-      <w:proofErr w:type="spellStart"/>
-      <w:r>
-        <w:rPr>
-          <w:rFonts w:ascii="Calibri" w:hAnsi="Calibri" w:cs="Calibri"/>
-        </w:rPr>
-        <w:t>total_inches_of_rainfall</w:t>
-      </w:r>
-      <w:proofErr w:type="spellEnd"/>
-      <w:r>
-        <w:rPr>
-          <w:rFonts w:ascii="Calibri" w:hAnsi="Calibri" w:cs="Calibri"/>
-        </w:rPr>
-        <w:t xml:space="preserve"> = 0.0</w:t>
-      </w:r>
-      <w:r>
-        <w:rPr>
-          <w:rFonts w:ascii="Calibri" w:hAnsi="Calibri" w:cs="Calibri"/>
-        </w:rPr>
-        <w:br/>
-      </w:r>
-      <w:proofErr w:type="spellStart"/>
-      <w:r>
-        <w:rPr>
-          <w:rFonts w:ascii="Calibri" w:hAnsi="Calibri" w:cs="Calibri"/>
-        </w:rPr>
-        <w:t>total_months_count</w:t>
-      </w:r>
-      <w:proofErr w:type="spellEnd"/>
-      <w:r>
-        <w:rPr>
-          <w:rFonts w:ascii="Calibri" w:hAnsi="Calibri" w:cs="Calibri"/>
-        </w:rPr>
-        <w:t xml:space="preserve"> = 0</w:t>
+        <w:t>total_inches_of_rainfall = 0.0</w:t>
+      </w:r>
+      <w:r>
+        <w:rPr>
+          <w:rFonts w:ascii="Calibri" w:hAnsi="Calibri" w:cs="Calibri"/>
+        </w:rPr>
+        <w:br/>
+        <w:t>total_months_count = 0</w:t>
       </w:r>
       <w:r>
         <w:rPr>
@@ -643,48 +585,20 @@
           <w:rFonts w:ascii="Calibri" w:hAnsi="Calibri" w:cs="Calibri"/>
         </w:rPr>
         <w:br/>
-        <w:t xml:space="preserve">        </w:t>
-      </w:r>
-      <w:proofErr w:type="spellStart"/>
-      <w:r>
-        <w:rPr>
-          <w:rFonts w:ascii="Calibri" w:hAnsi="Calibri" w:cs="Calibri"/>
-        </w:rPr>
-        <w:t>total_years</w:t>
-      </w:r>
-      <w:proofErr w:type="spellEnd"/>
-      <w:r>
-        <w:rPr>
-          <w:rFonts w:ascii="Calibri" w:hAnsi="Calibri" w:cs="Calibri"/>
-        </w:rPr>
-        <w:t xml:space="preserve"> = int(input("Enter the total number of years over which average rainfall to be calculated: "))</w:t>
-      </w:r>
-      <w:r>
-        <w:rPr>
-          <w:rFonts w:ascii="Calibri" w:hAnsi="Calibri" w:cs="Calibri"/>
-        </w:rPr>
-        <w:br/>
-      </w:r>
-      <w:r>
-        <w:rPr>
-          <w:rFonts w:ascii="Calibri" w:hAnsi="Calibri" w:cs="Calibri"/>
-        </w:rPr>
-        <w:br/>
-        <w:t xml:space="preserve">        if </w:t>
-      </w:r>
-      <w:proofErr w:type="spellStart"/>
-      <w:r>
-        <w:rPr>
-          <w:rFonts w:ascii="Calibri" w:hAnsi="Calibri" w:cs="Calibri"/>
-        </w:rPr>
-        <w:t>total_years</w:t>
-      </w:r>
-      <w:proofErr w:type="spellEnd"/>
-      <w:r>
-        <w:rPr>
-          <w:rFonts w:ascii="Calibri" w:hAnsi="Calibri" w:cs="Calibri"/>
-        </w:rPr>
-        <w:t xml:space="preserve"> &lt;= 0:</w:t>
+        <w:t xml:space="preserve">        total_years = int(input("Enter the total number of years over which average rainfall to be calculated: "))</w:t>
+      </w:r>
+      <w:r>
+        <w:rPr>
+          <w:rFonts w:ascii="Calibri" w:hAnsi="Calibri" w:cs="Calibri"/>
+        </w:rPr>
+        <w:br/>
+      </w:r>
+      <w:r>
+        <w:rPr>
+          <w:rFonts w:ascii="Calibri" w:hAnsi="Calibri" w:cs="Calibri"/>
+        </w:rPr>
+        <w:br/>
+        <w:t xml:space="preserve">        if total_years &lt;= 0:</w:t>
       </w:r>
       <w:r>
         <w:rPr>
@@ -712,21 +626,7 @@
           <w:rFonts w:ascii="Calibri" w:hAnsi="Calibri" w:cs="Calibri"/>
         </w:rPr>
         <w:br/>
-        <w:t xml:space="preserve">    except </w:t>
-      </w:r>
-      <w:proofErr w:type="spellStart"/>
-      <w:r>
-        <w:rPr>
-          <w:rFonts w:ascii="Calibri" w:hAnsi="Calibri" w:cs="Calibri"/>
-        </w:rPr>
-        <w:t>ValueError</w:t>
-      </w:r>
-      <w:proofErr w:type="spellEnd"/>
-      <w:r>
-        <w:rPr>
-          <w:rFonts w:ascii="Calibri" w:hAnsi="Calibri" w:cs="Calibri"/>
-        </w:rPr>
-        <w:t>:</w:t>
+        <w:t xml:space="preserve">    except ValueError:</w:t>
       </w:r>
       <w:r>
         <w:rPr>
@@ -753,42 +653,14 @@
           <w:rFonts w:ascii="Calibri" w:hAnsi="Calibri" w:cs="Calibri"/>
         </w:rPr>
         <w:br/>
-        <w:t xml:space="preserve">for year in range(1, </w:t>
-      </w:r>
-      <w:proofErr w:type="spellStart"/>
-      <w:r>
-        <w:rPr>
-          <w:rFonts w:ascii="Calibri" w:hAnsi="Calibri" w:cs="Calibri"/>
-        </w:rPr>
-        <w:t>total_years</w:t>
-      </w:r>
-      <w:proofErr w:type="spellEnd"/>
-      <w:r>
-        <w:rPr>
-          <w:rFonts w:ascii="Calibri" w:hAnsi="Calibri" w:cs="Calibri"/>
-        </w:rPr>
-        <w:t xml:space="preserve"> + 1):</w:t>
-      </w:r>
-      <w:r>
-        <w:rPr>
-          <w:rFonts w:ascii="Calibri" w:hAnsi="Calibri" w:cs="Calibri"/>
-        </w:rPr>
-        <w:br/>
-        <w:t xml:space="preserve">    print(f"\</w:t>
-      </w:r>
-      <w:proofErr w:type="spellStart"/>
-      <w:r>
-        <w:rPr>
-          <w:rFonts w:ascii="Calibri" w:hAnsi="Calibri" w:cs="Calibri"/>
-        </w:rPr>
-        <w:t>nYear</w:t>
-      </w:r>
-      <w:proofErr w:type="spellEnd"/>
-      <w:r>
-        <w:rPr>
-          <w:rFonts w:ascii="Calibri" w:hAnsi="Calibri" w:cs="Calibri"/>
-        </w:rPr>
-        <w:t xml:space="preserve"> {year}")</w:t>
+        <w:t>for year in range(1, total_years + 1):</w:t>
+      </w:r>
+      <w:r>
+        <w:rPr>
+          <w:rFonts w:ascii="Calibri" w:hAnsi="Calibri" w:cs="Calibri"/>
+        </w:rPr>
+        <w:br/>
+        <w:t xml:space="preserve">    print(f"\nYear {year}")</w:t>
       </w:r>
       <w:r>
         <w:rPr>
@@ -842,35 +714,7 @@
           <w:rFonts w:ascii="Calibri" w:hAnsi="Calibri" w:cs="Calibri"/>
         </w:rPr>
         <w:br/>
-        <w:t xml:space="preserve">                </w:t>
-      </w:r>
-      <w:proofErr w:type="spellStart"/>
-      <w:r>
-        <w:rPr>
-          <w:rFonts w:ascii="Calibri" w:hAnsi="Calibri" w:cs="Calibri"/>
-        </w:rPr>
-        <w:t>rainfall_in_inches</w:t>
-      </w:r>
-      <w:proofErr w:type="spellEnd"/>
-      <w:r>
-        <w:rPr>
-          <w:rFonts w:ascii="Calibri" w:hAnsi="Calibri" w:cs="Calibri"/>
-        </w:rPr>
-        <w:t xml:space="preserve"> = float(input(</w:t>
-      </w:r>
-      <w:proofErr w:type="spellStart"/>
-      <w:r>
-        <w:rPr>
-          <w:rFonts w:ascii="Calibri" w:hAnsi="Calibri" w:cs="Calibri"/>
-        </w:rPr>
-        <w:t>f"Enter</w:t>
-      </w:r>
-      <w:proofErr w:type="spellEnd"/>
-      <w:r>
-        <w:rPr>
-          <w:rFonts w:ascii="Calibri" w:hAnsi="Calibri" w:cs="Calibri"/>
-        </w:rPr>
-        <w:t xml:space="preserve"> the rainfall in inches for month {month}: "))</w:t>
+        <w:t xml:space="preserve">                rainfall_in_inches = float(input(f"Enter the rainfall in inches for month {month}: "))</w:t>
       </w:r>
       <w:r>
         <w:rPr>
@@ -884,21 +728,7 @@
         </w:rPr>
         <w:lastRenderedPageBreak/>
         <w:br/>
-        <w:t xml:space="preserve">                if </w:t>
-      </w:r>
-      <w:proofErr w:type="spellStart"/>
-      <w:r>
-        <w:rPr>
-          <w:rFonts w:ascii="Calibri" w:hAnsi="Calibri" w:cs="Calibri"/>
-        </w:rPr>
-        <w:t>rainfall_in_inches</w:t>
-      </w:r>
-      <w:proofErr w:type="spellEnd"/>
-      <w:r>
-        <w:rPr>
-          <w:rFonts w:ascii="Calibri" w:hAnsi="Calibri" w:cs="Calibri"/>
-        </w:rPr>
-        <w:t xml:space="preserve"> &lt; 0:</w:t>
+        <w:t xml:space="preserve">                if rainfall_in_inches &lt; 0:</w:t>
       </w:r>
       <w:r>
         <w:rPr>
@@ -926,21 +756,7 @@
           <w:rFonts w:ascii="Calibri" w:hAnsi="Calibri" w:cs="Calibri"/>
         </w:rPr>
         <w:br/>
-        <w:t xml:space="preserve">            except </w:t>
-      </w:r>
-      <w:proofErr w:type="spellStart"/>
-      <w:r>
-        <w:rPr>
-          <w:rFonts w:ascii="Calibri" w:hAnsi="Calibri" w:cs="Calibri"/>
-        </w:rPr>
-        <w:t>ValueError</w:t>
-      </w:r>
-      <w:proofErr w:type="spellEnd"/>
-      <w:r>
-        <w:rPr>
-          <w:rFonts w:ascii="Calibri" w:hAnsi="Calibri" w:cs="Calibri"/>
-        </w:rPr>
-        <w:t>:</w:t>
+        <w:t xml:space="preserve">            except ValueError:</w:t>
       </w:r>
       <w:r>
         <w:rPr>
@@ -960,99 +776,28 @@
           <w:rFonts w:ascii="Calibri" w:hAnsi="Calibri" w:cs="Calibri"/>
         </w:rPr>
         <w:br/>
-        <w:t xml:space="preserve">        </w:t>
-      </w:r>
-      <w:proofErr w:type="spellStart"/>
-      <w:r>
-        <w:rPr>
-          <w:rFonts w:ascii="Calibri" w:hAnsi="Calibri" w:cs="Calibri"/>
-        </w:rPr>
-        <w:t>total_inches_of_rainfall</w:t>
-      </w:r>
-      <w:proofErr w:type="spellEnd"/>
-      <w:r>
-        <w:rPr>
-          <w:rFonts w:ascii="Calibri" w:hAnsi="Calibri" w:cs="Calibri"/>
-        </w:rPr>
-        <w:t xml:space="preserve"> += </w:t>
-      </w:r>
-      <w:proofErr w:type="spellStart"/>
-      <w:r>
-        <w:rPr>
-          <w:rFonts w:ascii="Calibri" w:hAnsi="Calibri" w:cs="Calibri"/>
-        </w:rPr>
-        <w:t>rainfall_in_inches</w:t>
-      </w:r>
-      <w:proofErr w:type="spellEnd"/>
-      <w:r>
-        <w:rPr>
-          <w:rFonts w:ascii="Calibri" w:hAnsi="Calibri" w:cs="Calibri"/>
-        </w:rPr>
-        <w:br/>
-        <w:t xml:space="preserve">        </w:t>
-      </w:r>
-      <w:proofErr w:type="spellStart"/>
-      <w:r>
-        <w:rPr>
-          <w:rFonts w:ascii="Calibri" w:hAnsi="Calibri" w:cs="Calibri"/>
-        </w:rPr>
-        <w:t>total_months_count</w:t>
-      </w:r>
-      <w:proofErr w:type="spellEnd"/>
-      <w:r>
-        <w:rPr>
-          <w:rFonts w:ascii="Calibri" w:hAnsi="Calibri" w:cs="Calibri"/>
-        </w:rPr>
-        <w:t xml:space="preserve"> += 1</w:t>
-      </w:r>
-      <w:r>
-        <w:rPr>
-          <w:rFonts w:ascii="Calibri" w:hAnsi="Calibri" w:cs="Calibri"/>
-        </w:rPr>
-        <w:br/>
-      </w:r>
-      <w:r>
-        <w:rPr>
-          <w:rFonts w:ascii="Calibri" w:hAnsi="Calibri" w:cs="Calibri"/>
-        </w:rPr>
-        <w:br/>
-      </w:r>
-      <w:proofErr w:type="spellStart"/>
-      <w:r>
-        <w:rPr>
-          <w:rFonts w:ascii="Calibri" w:hAnsi="Calibri" w:cs="Calibri"/>
-        </w:rPr>
-        <w:t>average_rainfall_in_inches</w:t>
-      </w:r>
-      <w:proofErr w:type="spellEnd"/>
-      <w:r>
-        <w:rPr>
-          <w:rFonts w:ascii="Calibri" w:hAnsi="Calibri" w:cs="Calibri"/>
-        </w:rPr>
-        <w:t xml:space="preserve"> = </w:t>
-      </w:r>
-      <w:proofErr w:type="spellStart"/>
-      <w:r>
-        <w:rPr>
-          <w:rFonts w:ascii="Calibri" w:hAnsi="Calibri" w:cs="Calibri"/>
-        </w:rPr>
-        <w:t>total_inches_of_rainfall</w:t>
-      </w:r>
-      <w:proofErr w:type="spellEnd"/>
-      <w:r>
-        <w:rPr>
-          <w:rFonts w:ascii="Calibri" w:hAnsi="Calibri" w:cs="Calibri"/>
-        </w:rPr>
-        <w:t xml:space="preserve"> / </w:t>
-      </w:r>
-      <w:proofErr w:type="spellStart"/>
-      <w:r>
-        <w:rPr>
-          <w:rFonts w:ascii="Calibri" w:hAnsi="Calibri" w:cs="Calibri"/>
-        </w:rPr>
-        <w:t>total_months_count</w:t>
-      </w:r>
-      <w:proofErr w:type="spellEnd"/>
+        <w:t xml:space="preserve">        total_inches_of_rainfall += rainfall_in_inches</w:t>
+      </w:r>
+      <w:r>
+        <w:rPr>
+          <w:rFonts w:ascii="Calibri" w:hAnsi="Calibri" w:cs="Calibri"/>
+        </w:rPr>
+        <w:br/>
+        <w:t xml:space="preserve">        total_months_count += 1</w:t>
+      </w:r>
+      <w:r>
+        <w:rPr>
+          <w:rFonts w:ascii="Calibri" w:hAnsi="Calibri" w:cs="Calibri"/>
+        </w:rPr>
+        <w:br/>
+      </w:r>
+      <w:r>
+        <w:rPr>
+          <w:rFonts w:ascii="Calibri" w:hAnsi="Calibri" w:cs="Calibri"/>
+        </w:rPr>
+        <w:br/>
+        <w:t>average_rainfall_in_inches = total_inches_of_rainfall / total_months_count</w:t>
+      </w:r>
       <w:r>
         <w:rPr>
           <w:rFonts w:ascii="Calibri" w:hAnsi="Calibri" w:cs="Calibri"/>
@@ -1071,63 +816,21 @@
           <w:rFonts w:ascii="Calibri" w:hAnsi="Calibri" w:cs="Calibri"/>
         </w:rPr>
         <w:br/>
-        <w:t xml:space="preserve">print("Total Months                           :", </w:t>
-      </w:r>
-      <w:proofErr w:type="spellStart"/>
-      <w:r>
-        <w:rPr>
-          <w:rFonts w:ascii="Calibri" w:hAnsi="Calibri" w:cs="Calibri"/>
-        </w:rPr>
-        <w:t>total_months_count</w:t>
-      </w:r>
-      <w:proofErr w:type="spellEnd"/>
-      <w:r>
-        <w:rPr>
-          <w:rFonts w:ascii="Calibri" w:hAnsi="Calibri" w:cs="Calibri"/>
-        </w:rPr>
-        <w:t>)</w:t>
-      </w:r>
-      <w:r>
-        <w:rPr>
-          <w:rFonts w:ascii="Calibri" w:hAnsi="Calibri" w:cs="Calibri"/>
-        </w:rPr>
-        <w:br/>
-        <w:t>print("Total Rainfall (in Inches)             :", format(</w:t>
-      </w:r>
-      <w:proofErr w:type="spellStart"/>
-      <w:r>
-        <w:rPr>
-          <w:rFonts w:ascii="Calibri" w:hAnsi="Calibri" w:cs="Calibri"/>
-        </w:rPr>
-        <w:t>total_inches_of_rainfall</w:t>
-      </w:r>
-      <w:proofErr w:type="spellEnd"/>
-      <w:r>
-        <w:rPr>
-          <w:rFonts w:ascii="Calibri" w:hAnsi="Calibri" w:cs="Calibri"/>
-        </w:rPr>
-        <w:t>, ".2f"))</w:t>
-      </w:r>
-      <w:r>
-        <w:rPr>
-          <w:rFonts w:ascii="Calibri" w:hAnsi="Calibri" w:cs="Calibri"/>
-        </w:rPr>
-        <w:br/>
-        <w:t>print("Average Rainfall per Month (in Inches) :", format(</w:t>
-      </w:r>
-      <w:proofErr w:type="spellStart"/>
-      <w:r>
-        <w:rPr>
-          <w:rFonts w:ascii="Calibri" w:hAnsi="Calibri" w:cs="Calibri"/>
-        </w:rPr>
-        <w:t>average_rainfall_in_inches</w:t>
-      </w:r>
-      <w:proofErr w:type="spellEnd"/>
-      <w:r>
-        <w:rPr>
-          <w:rFonts w:ascii="Calibri" w:hAnsi="Calibri" w:cs="Calibri"/>
-        </w:rPr>
-        <w:t>, ".2f"))</w:t>
+        <w:t>print("Total Months                           :", total_months_count)</w:t>
+      </w:r>
+      <w:r>
+        <w:rPr>
+          <w:rFonts w:ascii="Calibri" w:hAnsi="Calibri" w:cs="Calibri"/>
+        </w:rPr>
+        <w:br/>
+        <w:t>print("Total Rainfall (in Inches)             :", format(total_inches_of_rainfall, ".2f"))</w:t>
+      </w:r>
+      <w:r>
+        <w:rPr>
+          <w:rFonts w:ascii="Calibri" w:hAnsi="Calibri" w:cs="Calibri"/>
+        </w:rPr>
+        <w:br/>
+        <w:t>print("Average Rainfall per Month (in Inches) :", format(average_rainfall_in_inches, ".2f"))</w:t>
       </w:r>
       <w:r>
         <w:rPr>
@@ -2518,11 +2221,9 @@
         <w:br/>
         <w:t xml:space="preserve">If </w:t>
       </w:r>
-      <w:proofErr w:type="spellStart"/>
       <w:r>
         <w:t>books_purchased</w:t>
       </w:r>
-      <w:proofErr w:type="spellEnd"/>
       <w:r>
         <w:t xml:space="preserve"> </w:t>
       </w:r>
@@ -2537,11 +2238,9 @@
         <w:br/>
         <w:t xml:space="preserve">Else if </w:t>
       </w:r>
-      <w:proofErr w:type="spellStart"/>
       <w:r>
         <w:t>books_purchased</w:t>
       </w:r>
-      <w:proofErr w:type="spellEnd"/>
       <w:r>
         <w:t xml:space="preserve"> </w:t>
       </w:r>
@@ -2556,11 +2255,9 @@
         <w:br/>
         <w:t xml:space="preserve">Else if </w:t>
       </w:r>
-      <w:proofErr w:type="spellStart"/>
       <w:r>
         <w:t>books_purchased</w:t>
       </w:r>
-      <w:proofErr w:type="spellEnd"/>
       <w:r>
         <w:t xml:space="preserve"> </w:t>
       </w:r>
@@ -2575,11 +2272,9 @@
         <w:br/>
         <w:t xml:space="preserve">Else if </w:t>
       </w:r>
-      <w:proofErr w:type="spellStart"/>
       <w:r>
         <w:t>books_purchased</w:t>
       </w:r>
-      <w:proofErr w:type="spellEnd"/>
       <w:r>
         <w:t xml:space="preserve"> </w:t>
       </w:r>
@@ -2594,11 +2289,9 @@
         <w:br/>
         <w:t xml:space="preserve">Else if </w:t>
       </w:r>
-      <w:proofErr w:type="spellStart"/>
       <w:r>
         <w:t>books_purchased</w:t>
       </w:r>
-      <w:proofErr w:type="spellEnd"/>
       <w:r>
         <w:t xml:space="preserve"> </w:t>
       </w:r>
@@ -2845,21 +2538,7 @@
           <w:rFonts w:ascii="Calibri" w:hAnsi="Calibri" w:cs="Calibri"/>
         </w:rPr>
         <w:br/>
-        <w:t xml:space="preserve">        </w:t>
-      </w:r>
-      <w:proofErr w:type="spellStart"/>
-      <w:r>
-        <w:rPr>
-          <w:rFonts w:ascii="Calibri" w:hAnsi="Calibri" w:cs="Calibri"/>
-        </w:rPr>
-        <w:t>books_purchased</w:t>
-      </w:r>
-      <w:proofErr w:type="spellEnd"/>
-      <w:r>
-        <w:rPr>
-          <w:rFonts w:ascii="Calibri" w:hAnsi="Calibri" w:cs="Calibri"/>
-        </w:rPr>
-        <w:t xml:space="preserve"> = int(input("Enter the number of books purchased in this month: "))</w:t>
+        <w:t xml:space="preserve">        books_purchased = int(input("Enter the number of books purchased in this month: "))</w:t>
       </w:r>
       <w:r>
         <w:rPr>
@@ -2873,21 +2552,7 @@
           <w:rFonts w:ascii="Calibri" w:hAnsi="Calibri" w:cs="Calibri"/>
         </w:rPr>
         <w:br/>
-        <w:t xml:space="preserve">        if </w:t>
-      </w:r>
-      <w:proofErr w:type="spellStart"/>
-      <w:r>
-        <w:rPr>
-          <w:rFonts w:ascii="Calibri" w:hAnsi="Calibri" w:cs="Calibri"/>
-        </w:rPr>
-        <w:t>books_purchased</w:t>
-      </w:r>
-      <w:proofErr w:type="spellEnd"/>
-      <w:r>
-        <w:rPr>
-          <w:rFonts w:ascii="Calibri" w:hAnsi="Calibri" w:cs="Calibri"/>
-        </w:rPr>
-        <w:t xml:space="preserve"> &lt; 0:</w:t>
+        <w:t xml:space="preserve">        if books_purchased &lt; 0:</w:t>
       </w:r>
       <w:r>
         <w:rPr>
@@ -2915,21 +2580,7 @@
           <w:rFonts w:ascii="Calibri" w:hAnsi="Calibri" w:cs="Calibri"/>
         </w:rPr>
         <w:br/>
-        <w:t xml:space="preserve">    except </w:t>
-      </w:r>
-      <w:proofErr w:type="spellStart"/>
-      <w:r>
-        <w:rPr>
-          <w:rFonts w:ascii="Calibri" w:hAnsi="Calibri" w:cs="Calibri"/>
-        </w:rPr>
-        <w:t>ValueError</w:t>
-      </w:r>
-      <w:proofErr w:type="spellEnd"/>
-      <w:r>
-        <w:rPr>
-          <w:rFonts w:ascii="Calibri" w:hAnsi="Calibri" w:cs="Calibri"/>
-        </w:rPr>
-        <w:t>:</w:t>
+        <w:t xml:space="preserve">    except ValueError:</w:t>
       </w:r>
       <w:r>
         <w:rPr>
@@ -2956,262 +2607,70 @@
           <w:rFonts w:ascii="Calibri" w:hAnsi="Calibri" w:cs="Calibri"/>
         </w:rPr>
         <w:br/>
-        <w:t xml:space="preserve">if </w:t>
-      </w:r>
-      <w:proofErr w:type="spellStart"/>
-      <w:r>
-        <w:rPr>
-          <w:rFonts w:ascii="Calibri" w:hAnsi="Calibri" w:cs="Calibri"/>
-        </w:rPr>
-        <w:t>books_purchased</w:t>
-      </w:r>
-      <w:proofErr w:type="spellEnd"/>
-      <w:r>
-        <w:rPr>
-          <w:rFonts w:ascii="Calibri" w:hAnsi="Calibri" w:cs="Calibri"/>
-        </w:rPr>
-        <w:t xml:space="preserve"> == 0:</w:t>
-      </w:r>
-      <w:r>
-        <w:rPr>
-          <w:rFonts w:ascii="Calibri" w:hAnsi="Calibri" w:cs="Calibri"/>
-        </w:rPr>
-        <w:br/>
-        <w:t xml:space="preserve">    </w:t>
-      </w:r>
-      <w:proofErr w:type="spellStart"/>
-      <w:r>
-        <w:rPr>
-          <w:rFonts w:ascii="Calibri" w:hAnsi="Calibri" w:cs="Calibri"/>
-        </w:rPr>
-        <w:t>book_points</w:t>
-      </w:r>
-      <w:proofErr w:type="spellEnd"/>
-      <w:r>
-        <w:rPr>
-          <w:rFonts w:ascii="Calibri" w:hAnsi="Calibri" w:cs="Calibri"/>
-        </w:rPr>
-        <w:t xml:space="preserve"> = 0</w:t>
-      </w:r>
-      <w:r>
-        <w:rPr>
-          <w:rFonts w:ascii="Calibri" w:hAnsi="Calibri" w:cs="Calibri"/>
-        </w:rPr>
-        <w:br/>
-      </w:r>
-      <w:proofErr w:type="spellStart"/>
-      <w:r>
-        <w:rPr>
-          <w:rFonts w:ascii="Calibri" w:hAnsi="Calibri" w:cs="Calibri"/>
-        </w:rPr>
-        <w:t>elif</w:t>
-      </w:r>
-      <w:proofErr w:type="spellEnd"/>
-      <w:r>
-        <w:rPr>
-          <w:rFonts w:ascii="Calibri" w:hAnsi="Calibri" w:cs="Calibri"/>
-        </w:rPr>
-        <w:t xml:space="preserve"> </w:t>
-      </w:r>
-      <w:proofErr w:type="spellStart"/>
-      <w:r>
-        <w:rPr>
-          <w:rFonts w:ascii="Calibri" w:hAnsi="Calibri" w:cs="Calibri"/>
-        </w:rPr>
-        <w:t>books_purchased</w:t>
-      </w:r>
-      <w:proofErr w:type="spellEnd"/>
-      <w:r>
-        <w:rPr>
-          <w:rFonts w:ascii="Calibri" w:hAnsi="Calibri" w:cs="Calibri"/>
-        </w:rPr>
-        <w:t xml:space="preserve"> == 2:</w:t>
-      </w:r>
-      <w:r>
-        <w:rPr>
-          <w:rFonts w:ascii="Calibri" w:hAnsi="Calibri" w:cs="Calibri"/>
-        </w:rPr>
-        <w:br/>
-        <w:t xml:space="preserve">    </w:t>
-      </w:r>
-      <w:proofErr w:type="spellStart"/>
-      <w:r>
-        <w:rPr>
-          <w:rFonts w:ascii="Calibri" w:hAnsi="Calibri" w:cs="Calibri"/>
-        </w:rPr>
-        <w:t>book_points</w:t>
-      </w:r>
-      <w:proofErr w:type="spellEnd"/>
-      <w:r>
-        <w:rPr>
-          <w:rFonts w:ascii="Calibri" w:hAnsi="Calibri" w:cs="Calibri"/>
-        </w:rPr>
-        <w:t xml:space="preserve"> = 5</w:t>
-      </w:r>
-      <w:r>
-        <w:rPr>
-          <w:rFonts w:ascii="Calibri" w:hAnsi="Calibri" w:cs="Calibri"/>
-        </w:rPr>
-        <w:br/>
-      </w:r>
-      <w:proofErr w:type="spellStart"/>
-      <w:r>
-        <w:rPr>
-          <w:rFonts w:ascii="Calibri" w:hAnsi="Calibri" w:cs="Calibri"/>
-        </w:rPr>
-        <w:t>elif</w:t>
-      </w:r>
-      <w:proofErr w:type="spellEnd"/>
-      <w:r>
-        <w:rPr>
-          <w:rFonts w:ascii="Calibri" w:hAnsi="Calibri" w:cs="Calibri"/>
-        </w:rPr>
-        <w:t xml:space="preserve"> </w:t>
-      </w:r>
-      <w:proofErr w:type="spellStart"/>
-      <w:r>
-        <w:rPr>
-          <w:rFonts w:ascii="Calibri" w:hAnsi="Calibri" w:cs="Calibri"/>
-        </w:rPr>
-        <w:t>books_purchased</w:t>
-      </w:r>
-      <w:proofErr w:type="spellEnd"/>
-      <w:r>
-        <w:rPr>
-          <w:rFonts w:ascii="Calibri" w:hAnsi="Calibri" w:cs="Calibri"/>
-        </w:rPr>
-        <w:t xml:space="preserve"> == 4:</w:t>
-      </w:r>
-      <w:r>
-        <w:rPr>
-          <w:rFonts w:ascii="Calibri" w:hAnsi="Calibri" w:cs="Calibri"/>
-        </w:rPr>
-        <w:br/>
-        <w:t xml:space="preserve">    </w:t>
-      </w:r>
-      <w:proofErr w:type="spellStart"/>
-      <w:r>
-        <w:rPr>
-          <w:rFonts w:ascii="Calibri" w:hAnsi="Calibri" w:cs="Calibri"/>
-        </w:rPr>
-        <w:t>book_points</w:t>
-      </w:r>
-      <w:proofErr w:type="spellEnd"/>
-      <w:r>
-        <w:rPr>
-          <w:rFonts w:ascii="Calibri" w:hAnsi="Calibri" w:cs="Calibri"/>
-        </w:rPr>
-        <w:t xml:space="preserve"> = 15</w:t>
-      </w:r>
-      <w:r>
-        <w:rPr>
-          <w:rFonts w:ascii="Calibri" w:hAnsi="Calibri" w:cs="Calibri"/>
-        </w:rPr>
-        <w:br/>
-      </w:r>
-      <w:proofErr w:type="spellStart"/>
-      <w:r>
-        <w:rPr>
-          <w:rFonts w:ascii="Calibri" w:hAnsi="Calibri" w:cs="Calibri"/>
-        </w:rPr>
-        <w:t>elif</w:t>
-      </w:r>
-      <w:proofErr w:type="spellEnd"/>
-      <w:r>
-        <w:rPr>
-          <w:rFonts w:ascii="Calibri" w:hAnsi="Calibri" w:cs="Calibri"/>
-        </w:rPr>
-        <w:t xml:space="preserve"> </w:t>
-      </w:r>
-      <w:proofErr w:type="spellStart"/>
-      <w:r>
-        <w:rPr>
-          <w:rFonts w:ascii="Calibri" w:hAnsi="Calibri" w:cs="Calibri"/>
-        </w:rPr>
-        <w:t>books_purchased</w:t>
-      </w:r>
-      <w:proofErr w:type="spellEnd"/>
-      <w:r>
-        <w:rPr>
-          <w:rFonts w:ascii="Calibri" w:hAnsi="Calibri" w:cs="Calibri"/>
-        </w:rPr>
-        <w:t xml:space="preserve"> == 6:</w:t>
-      </w:r>
-      <w:r>
-        <w:rPr>
-          <w:rFonts w:ascii="Calibri" w:hAnsi="Calibri" w:cs="Calibri"/>
-        </w:rPr>
-        <w:br/>
-        <w:t xml:space="preserve">    </w:t>
-      </w:r>
-      <w:proofErr w:type="spellStart"/>
-      <w:r>
-        <w:rPr>
-          <w:rFonts w:ascii="Calibri" w:hAnsi="Calibri" w:cs="Calibri"/>
-        </w:rPr>
-        <w:t>book_points</w:t>
-      </w:r>
-      <w:proofErr w:type="spellEnd"/>
-      <w:r>
-        <w:rPr>
-          <w:rFonts w:ascii="Calibri" w:hAnsi="Calibri" w:cs="Calibri"/>
-        </w:rPr>
-        <w:t xml:space="preserve"> = 30</w:t>
-      </w:r>
-      <w:r>
-        <w:rPr>
-          <w:rFonts w:ascii="Calibri" w:hAnsi="Calibri" w:cs="Calibri"/>
-        </w:rPr>
-        <w:br/>
-      </w:r>
-      <w:proofErr w:type="spellStart"/>
-      <w:r>
-        <w:rPr>
-          <w:rFonts w:ascii="Calibri" w:hAnsi="Calibri" w:cs="Calibri"/>
-        </w:rPr>
-        <w:t>elif</w:t>
-      </w:r>
-      <w:proofErr w:type="spellEnd"/>
-      <w:r>
-        <w:rPr>
-          <w:rFonts w:ascii="Calibri" w:hAnsi="Calibri" w:cs="Calibri"/>
-        </w:rPr>
-        <w:t xml:space="preserve"> </w:t>
-      </w:r>
-      <w:proofErr w:type="spellStart"/>
-      <w:r>
-        <w:rPr>
-          <w:rFonts w:ascii="Calibri" w:hAnsi="Calibri" w:cs="Calibri"/>
-        </w:rPr>
-        <w:t>books_purchased</w:t>
-      </w:r>
-      <w:proofErr w:type="spellEnd"/>
-      <w:r>
-        <w:rPr>
-          <w:rFonts w:ascii="Calibri" w:hAnsi="Calibri" w:cs="Calibri"/>
-        </w:rPr>
-        <w:t xml:space="preserve"> &gt;= 8:</w:t>
-      </w:r>
-      <w:r>
-        <w:rPr>
-          <w:rFonts w:ascii="Calibri" w:hAnsi="Calibri" w:cs="Calibri"/>
-        </w:rPr>
-        <w:br/>
-        <w:t xml:space="preserve">    </w:t>
-      </w:r>
-      <w:proofErr w:type="spellStart"/>
-      <w:r>
-        <w:rPr>
-          <w:rFonts w:ascii="Calibri" w:hAnsi="Calibri" w:cs="Calibri"/>
-        </w:rPr>
-        <w:t>book_points</w:t>
-      </w:r>
-      <w:proofErr w:type="spellEnd"/>
-      <w:r>
-        <w:rPr>
-          <w:rFonts w:ascii="Calibri" w:hAnsi="Calibri" w:cs="Calibri"/>
-        </w:rPr>
-        <w:t xml:space="preserve"> = 60</w:t>
+        <w:t>if books_purchased == 0:</w:t>
+      </w:r>
+      <w:r>
+        <w:rPr>
+          <w:rFonts w:ascii="Calibri" w:hAnsi="Calibri" w:cs="Calibri"/>
+        </w:rPr>
+        <w:br/>
+        <w:t xml:space="preserve">    book_points = 0</w:t>
+      </w:r>
+      <w:r>
+        <w:rPr>
+          <w:rFonts w:ascii="Calibri" w:hAnsi="Calibri" w:cs="Calibri"/>
+        </w:rPr>
+        <w:br/>
+        <w:t>elif books_purchased == 2:</w:t>
+      </w:r>
+      <w:r>
+        <w:rPr>
+          <w:rFonts w:ascii="Calibri" w:hAnsi="Calibri" w:cs="Calibri"/>
+        </w:rPr>
+        <w:br/>
+        <w:t xml:space="preserve">    book_points = 5</w:t>
+      </w:r>
+      <w:r>
+        <w:rPr>
+          <w:rFonts w:ascii="Calibri" w:hAnsi="Calibri" w:cs="Calibri"/>
+        </w:rPr>
+        <w:br/>
+        <w:t>elif books_purchased == 4:</w:t>
+      </w:r>
+      <w:r>
+        <w:rPr>
+          <w:rFonts w:ascii="Calibri" w:hAnsi="Calibri" w:cs="Calibri"/>
+        </w:rPr>
+        <w:br/>
+        <w:t xml:space="preserve">    book_points = 15</w:t>
+      </w:r>
+      <w:r>
+        <w:rPr>
+          <w:rFonts w:ascii="Calibri" w:hAnsi="Calibri" w:cs="Calibri"/>
+        </w:rPr>
+        <w:br/>
+        <w:t>elif books_purchased == 6:</w:t>
+      </w:r>
+      <w:r>
+        <w:rPr>
+          <w:rFonts w:ascii="Calibri" w:hAnsi="Calibri" w:cs="Calibri"/>
+        </w:rPr>
+        <w:br/>
+        <w:t xml:space="preserve">    book_points = 30</w:t>
+      </w:r>
+      <w:r>
+        <w:rPr>
+          <w:rFonts w:ascii="Calibri" w:hAnsi="Calibri" w:cs="Calibri"/>
+        </w:rPr>
+        <w:br/>
+        <w:t>elif books_purchased &gt;= 8:</w:t>
+      </w:r>
+      <w:r>
+        <w:rPr>
+          <w:rFonts w:ascii="Calibri" w:hAnsi="Calibri" w:cs="Calibri"/>
+        </w:rPr>
+        <w:br/>
+        <w:t xml:space="preserve">    book_points = 60</w:t>
       </w:r>
       <w:r>
         <w:rPr>
@@ -3225,42 +2684,14 @@
           <w:rFonts w:ascii="Calibri" w:hAnsi="Calibri" w:cs="Calibri"/>
         </w:rPr>
         <w:br/>
-        <w:t xml:space="preserve">    </w:t>
-      </w:r>
-      <w:proofErr w:type="spellStart"/>
-      <w:r>
-        <w:rPr>
-          <w:rFonts w:ascii="Calibri" w:hAnsi="Calibri" w:cs="Calibri"/>
-        </w:rPr>
-        <w:t>book_points</w:t>
-      </w:r>
-      <w:proofErr w:type="spellEnd"/>
-      <w:r>
-        <w:rPr>
-          <w:rFonts w:ascii="Calibri" w:hAnsi="Calibri" w:cs="Calibri"/>
-        </w:rPr>
-        <w:t xml:space="preserve"> = "NA"</w:t>
-      </w:r>
-      <w:r>
-        <w:rPr>
-          <w:rFonts w:ascii="Calibri" w:hAnsi="Calibri" w:cs="Calibri"/>
-        </w:rPr>
-        <w:br/>
-        <w:t xml:space="preserve">    print("\</w:t>
-      </w:r>
-      <w:proofErr w:type="spellStart"/>
-      <w:r>
-        <w:rPr>
-          <w:rFonts w:ascii="Calibri" w:hAnsi="Calibri" w:cs="Calibri"/>
-        </w:rPr>
-        <w:t>nWarning</w:t>
-      </w:r>
-      <w:proofErr w:type="spellEnd"/>
-      <w:r>
-        <w:rPr>
-          <w:rFonts w:ascii="Calibri" w:hAnsi="Calibri" w:cs="Calibri"/>
-        </w:rPr>
-        <w:t>!! Points are awarded only for purchasing of 2, 4, 6, or 8+ books.")</w:t>
+        <w:t xml:space="preserve">    book_points = "NA"</w:t>
+      </w:r>
+      <w:r>
+        <w:rPr>
+          <w:rFonts w:ascii="Calibri" w:hAnsi="Calibri" w:cs="Calibri"/>
+        </w:rPr>
+        <w:br/>
+        <w:t xml:space="preserve">    print("\nWarning!! Points are awarded only for purchasing of 2, 4, 6, or 8+ books.")</w:t>
       </w:r>
       <w:r>
         <w:rPr>
@@ -3286,63 +2717,21 @@
           <w:rFonts w:ascii="Calibri" w:hAnsi="Calibri" w:cs="Calibri"/>
         </w:rPr>
         <w:br/>
-        <w:t xml:space="preserve">print("Books Purchased (in Month)   :", </w:t>
-      </w:r>
-      <w:proofErr w:type="spellStart"/>
-      <w:r>
-        <w:rPr>
-          <w:rFonts w:ascii="Calibri" w:hAnsi="Calibri" w:cs="Calibri"/>
-        </w:rPr>
-        <w:t>books_purchased</w:t>
-      </w:r>
-      <w:proofErr w:type="spellEnd"/>
-      <w:r>
-        <w:rPr>
-          <w:rFonts w:ascii="Calibri" w:hAnsi="Calibri" w:cs="Calibri"/>
-        </w:rPr>
-        <w:t>, "Books")</w:t>
-      </w:r>
-      <w:r>
-        <w:rPr>
-          <w:rFonts w:ascii="Calibri" w:hAnsi="Calibri" w:cs="Calibri"/>
-        </w:rPr>
-        <w:br/>
-        <w:t xml:space="preserve">if </w:t>
-      </w:r>
-      <w:proofErr w:type="spellStart"/>
-      <w:r>
-        <w:rPr>
-          <w:rFonts w:ascii="Calibri" w:hAnsi="Calibri" w:cs="Calibri"/>
-        </w:rPr>
-        <w:t>book_points</w:t>
-      </w:r>
-      <w:proofErr w:type="spellEnd"/>
-      <w:r>
-        <w:rPr>
-          <w:rFonts w:ascii="Calibri" w:hAnsi="Calibri" w:cs="Calibri"/>
-        </w:rPr>
-        <w:t xml:space="preserve"> == "NA":</w:t>
-      </w:r>
-      <w:r>
-        <w:rPr>
-          <w:rFonts w:ascii="Calibri" w:hAnsi="Calibri" w:cs="Calibri"/>
-        </w:rPr>
-        <w:br/>
-        <w:t xml:space="preserve">    print("Book Points Awarded          :", </w:t>
-      </w:r>
-      <w:proofErr w:type="spellStart"/>
-      <w:r>
-        <w:rPr>
-          <w:rFonts w:ascii="Calibri" w:hAnsi="Calibri" w:cs="Calibri"/>
-        </w:rPr>
-        <w:t>book_points</w:t>
-      </w:r>
-      <w:proofErr w:type="spellEnd"/>
-      <w:r>
-        <w:rPr>
-          <w:rFonts w:ascii="Calibri" w:hAnsi="Calibri" w:cs="Calibri"/>
-        </w:rPr>
-        <w:t>, "(Invalid number of books for points calculation)")</w:t>
+        <w:t>print("Books Purchased (in Month)   :", books_purchased, "Books")</w:t>
+      </w:r>
+      <w:r>
+        <w:rPr>
+          <w:rFonts w:ascii="Calibri" w:hAnsi="Calibri" w:cs="Calibri"/>
+        </w:rPr>
+        <w:br/>
+        <w:t>if book_points == "NA":</w:t>
+      </w:r>
+      <w:r>
+        <w:rPr>
+          <w:rFonts w:ascii="Calibri" w:hAnsi="Calibri" w:cs="Calibri"/>
+        </w:rPr>
+        <w:br/>
+        <w:t xml:space="preserve">    print("Book Points Awarded          :", book_points, "(Invalid number of books for points calculation)")</w:t>
       </w:r>
       <w:r>
         <w:rPr>
@@ -3356,21 +2745,7 @@
           <w:rFonts w:ascii="Calibri" w:hAnsi="Calibri" w:cs="Calibri"/>
         </w:rPr>
         <w:br/>
-        <w:t xml:space="preserve">    print("Book Points Awarded          :", </w:t>
-      </w:r>
-      <w:proofErr w:type="spellStart"/>
-      <w:r>
-        <w:rPr>
-          <w:rFonts w:ascii="Calibri" w:hAnsi="Calibri" w:cs="Calibri"/>
-        </w:rPr>
-        <w:t>book_points</w:t>
-      </w:r>
-      <w:proofErr w:type="spellEnd"/>
-      <w:r>
-        <w:rPr>
-          <w:rFonts w:ascii="Calibri" w:hAnsi="Calibri" w:cs="Calibri"/>
-        </w:rPr>
-        <w:t>, "Points")</w:t>
+        <w:t xml:space="preserve">    print("Book Points Awarded          :", book_points, "Points")</w:t>
       </w:r>
       <w:r>
         <w:rPr>
@@ -4360,14 +3735,11 @@
     </w:p>
     <w:p>
       <w:r>
-        <w:rPr>
-          <w:noProof/>
-        </w:rPr>
         <w:drawing>
-          <wp:inline distT="0" distB="0" distL="0" distR="0" wp14:anchorId="5B2F2A91" wp14:editId="117F3A65">
-            <wp:extent cx="5943600" cy="3347085"/>
-            <wp:effectExtent l="0" t="0" r="0" b="5715"/>
-            <wp:docPr id="1538237078" name="Picture 1"/>
+          <wp:inline distT="0" distB="0" distL="0" distR="0" wp14:anchorId="2D638466" wp14:editId="56AABDAF">
+            <wp:extent cx="5943600" cy="3348355"/>
+            <wp:effectExtent l="0" t="0" r="0" b="4445"/>
+            <wp:docPr id="826829212" name="Picture 1"/>
             <wp:cNvGraphicFramePr>
               <a:graphicFrameLocks xmlns:a="http://schemas.openxmlformats.org/drawingml/2006/main" noChangeAspect="1"/>
             </wp:cNvGraphicFramePr>
@@ -4375,7 +3747,7 @@
               <a:graphicData uri="http://schemas.openxmlformats.org/drawingml/2006/picture">
                 <pic:pic xmlns:pic="http://schemas.openxmlformats.org/drawingml/2006/picture">
                   <pic:nvPicPr>
-                    <pic:cNvPr id="1538237078" name=""/>
+                    <pic:cNvPr id="826829212" name=""/>
                     <pic:cNvPicPr/>
                   </pic:nvPicPr>
                   <pic:blipFill>
@@ -4387,7 +3759,7 @@
                   <pic:spPr>
                     <a:xfrm>
                       <a:off x="0" y="0"/>
-                      <a:ext cx="5943600" cy="3347085"/>
+                      <a:ext cx="5943600" cy="3348355"/>
                     </a:xfrm>
                     <a:prstGeom prst="rect">
                       <a:avLst/>
@@ -4419,14 +3791,11 @@
     </w:p>
     <w:p>
       <w:r>
-        <w:rPr>
-          <w:noProof/>
-        </w:rPr>
         <w:drawing>
-          <wp:inline distT="0" distB="0" distL="0" distR="0" wp14:anchorId="0D19D969" wp14:editId="56C037CE">
-            <wp:extent cx="5943600" cy="1292225"/>
-            <wp:effectExtent l="0" t="0" r="0" b="3175"/>
-            <wp:docPr id="49324410" name="Picture 1"/>
+          <wp:inline distT="0" distB="0" distL="0" distR="0" wp14:anchorId="489EA7EA" wp14:editId="2F7C0375">
+            <wp:extent cx="5943600" cy="1431925"/>
+            <wp:effectExtent l="0" t="0" r="0" b="0"/>
+            <wp:docPr id="1804916869" name="Picture 1"/>
             <wp:cNvGraphicFramePr>
               <a:graphicFrameLocks xmlns:a="http://schemas.openxmlformats.org/drawingml/2006/main" noChangeAspect="1"/>
             </wp:cNvGraphicFramePr>
@@ -4434,7 +3803,7 @@
               <a:graphicData uri="http://schemas.openxmlformats.org/drawingml/2006/picture">
                 <pic:pic xmlns:pic="http://schemas.openxmlformats.org/drawingml/2006/picture">
                   <pic:nvPicPr>
-                    <pic:cNvPr id="49324410" name=""/>
+                    <pic:cNvPr id="1804916869" name=""/>
                     <pic:cNvPicPr/>
                   </pic:nvPicPr>
                   <pic:blipFill>
@@ -4446,7 +3815,7 @@
                   <pic:spPr>
                     <a:xfrm>
                       <a:off x="0" y="0"/>
-                      <a:ext cx="5943600" cy="1292225"/>
+                      <a:ext cx="5943600" cy="1431925"/>
                     </a:xfrm>
                     <a:prstGeom prst="rect">
                       <a:avLst/>
@@ -4462,7 +3831,6 @@
     <w:p/>
     <w:p/>
     <w:p/>
-    <w:p/>
     <w:p>
       <w:pPr>
         <w:rPr>
@@ -4510,13 +3878,12 @@
         <w:rPr>
           <w:b/>
           <w:bCs/>
-          <w:noProof/>
         </w:rPr>
         <w:drawing>
-          <wp:inline distT="0" distB="0" distL="0" distR="0" wp14:anchorId="12847E3F" wp14:editId="1A19FCEA">
-            <wp:extent cx="5943600" cy="1450340"/>
-            <wp:effectExtent l="0" t="0" r="0" b="0"/>
-            <wp:docPr id="1758232846" name="Picture 1"/>
+          <wp:inline distT="0" distB="0" distL="0" distR="0" wp14:anchorId="31875C9D" wp14:editId="2F773713">
+            <wp:extent cx="5943600" cy="1199515"/>
+            <wp:effectExtent l="0" t="0" r="0" b="635"/>
+            <wp:docPr id="157231826" name="Picture 1"/>
             <wp:cNvGraphicFramePr>
               <a:graphicFrameLocks xmlns:a="http://schemas.openxmlformats.org/drawingml/2006/main" noChangeAspect="1"/>
             </wp:cNvGraphicFramePr>
@@ -4524,7 +3891,7 @@
               <a:graphicData uri="http://schemas.openxmlformats.org/drawingml/2006/picture">
                 <pic:pic xmlns:pic="http://schemas.openxmlformats.org/drawingml/2006/picture">
                   <pic:nvPicPr>
-                    <pic:cNvPr id="1758232846" name=""/>
+                    <pic:cNvPr id="157231826" name=""/>
                     <pic:cNvPicPr/>
                   </pic:nvPicPr>
                   <pic:blipFill>
@@ -4536,7 +3903,7 @@
                   <pic:spPr>
                     <a:xfrm>
                       <a:off x="0" y="0"/>
-                      <a:ext cx="5943600" cy="1450340"/>
+                      <a:ext cx="5943600" cy="1199515"/>
                     </a:xfrm>
                     <a:prstGeom prst="rect">
                       <a:avLst/>
@@ -4564,32 +3931,53 @@
           <w:bCs/>
         </w:rPr>
       </w:pPr>
-      <w:r>
-        <w:rPr>
-          <w:b/>
-          <w:bCs/>
-        </w:rPr>
-        <w:t>Ignore .idea folder</w:t>
-      </w:r>
-    </w:p>
-    <w:p>
-      <w:pPr>
-        <w:rPr>
-          <w:b/>
-          <w:bCs/>
-        </w:rPr>
-      </w:pPr>
-      <w:r>
-        <w:rPr>
-          <w:b/>
-          <w:bCs/>
-          <w:noProof/>
+    </w:p>
+    <w:p>
+      <w:pPr>
+        <w:rPr>
+          <w:b/>
+          <w:bCs/>
+        </w:rPr>
+      </w:pPr>
+      <w:r>
+        <w:rPr>
+          <w:b/>
+          <w:bCs/>
+        </w:rPr>
+        <w:t>Adding  Assignment</w:t>
+      </w:r>
+      <w:r>
+        <w:rPr>
+          <w:b/>
+          <w:bCs/>
+        </w:rPr>
+        <w:t>5</w:t>
+      </w:r>
+      <w:r>
+        <w:rPr>
+          <w:b/>
+          <w:bCs/>
+        </w:rPr>
+        <w:t xml:space="preserve"> folder</w:t>
+      </w:r>
+    </w:p>
+    <w:p>
+      <w:pPr>
+        <w:rPr>
+          <w:b/>
+          <w:bCs/>
+        </w:rPr>
+      </w:pPr>
+      <w:r>
+        <w:rPr>
+          <w:b/>
+          <w:bCs/>
         </w:rPr>
         <w:drawing>
-          <wp:inline distT="0" distB="0" distL="0" distR="0" wp14:anchorId="5C4B55C3" wp14:editId="0A856C74">
-            <wp:extent cx="5943600" cy="1643380"/>
+          <wp:inline distT="0" distB="0" distL="0" distR="0" wp14:anchorId="3BDB3786" wp14:editId="557DA238">
+            <wp:extent cx="5943600" cy="1264285"/>
             <wp:effectExtent l="0" t="0" r="0" b="0"/>
-            <wp:docPr id="815084175" name="Picture 1"/>
+            <wp:docPr id="1421154077" name="Picture 1"/>
             <wp:cNvGraphicFramePr>
               <a:graphicFrameLocks xmlns:a="http://schemas.openxmlformats.org/drawingml/2006/main" noChangeAspect="1"/>
             </wp:cNvGraphicFramePr>
@@ -4597,7 +3985,7 @@
               <a:graphicData uri="http://schemas.openxmlformats.org/drawingml/2006/picture">
                 <pic:pic xmlns:pic="http://schemas.openxmlformats.org/drawingml/2006/picture">
                   <pic:nvPicPr>
-                    <pic:cNvPr id="815084175" name=""/>
+                    <pic:cNvPr id="1421154077" name=""/>
                     <pic:cNvPicPr/>
                   </pic:nvPicPr>
                   <pic:blipFill>
@@ -4609,7 +3997,7 @@
                   <pic:spPr>
                     <a:xfrm>
                       <a:off x="0" y="0"/>
-                      <a:ext cx="5943600" cy="1643380"/>
+                      <a:ext cx="5943600" cy="1264285"/>
                     </a:xfrm>
                     <a:prstGeom prst="rect">
                       <a:avLst/>
@@ -4643,11 +4031,16 @@
           <w:bCs/>
           <w:noProof/>
         </w:rPr>
+        <w:t>Commit Changes</w:t>
+      </w:r>
+    </w:p>
+    <w:p>
+      <w:r>
         <w:drawing>
-          <wp:inline distT="0" distB="0" distL="0" distR="0" wp14:anchorId="6E3C70A4" wp14:editId="725EA4F7">
-            <wp:extent cx="5943600" cy="1738630"/>
+          <wp:inline distT="0" distB="0" distL="0" distR="0" wp14:anchorId="51F84A81" wp14:editId="2B959946">
+            <wp:extent cx="5943600" cy="1834515"/>
             <wp:effectExtent l="0" t="0" r="0" b="0"/>
-            <wp:docPr id="1973573538" name="Picture 1"/>
+            <wp:docPr id="616329449" name="Picture 1"/>
             <wp:cNvGraphicFramePr>
               <a:graphicFrameLocks xmlns:a="http://schemas.openxmlformats.org/drawingml/2006/main" noChangeAspect="1"/>
             </wp:cNvGraphicFramePr>
@@ -4655,7 +4048,7 @@
               <a:graphicData uri="http://schemas.openxmlformats.org/drawingml/2006/picture">
                 <pic:pic xmlns:pic="http://schemas.openxmlformats.org/drawingml/2006/picture">
                   <pic:nvPicPr>
-                    <pic:cNvPr id="1973573538" name=""/>
+                    <pic:cNvPr id="616329449" name=""/>
                     <pic:cNvPicPr/>
                   </pic:nvPicPr>
                   <pic:blipFill>
@@ -4667,7 +4060,7 @@
                   <pic:spPr>
                     <a:xfrm>
                       <a:off x="0" y="0"/>
-                      <a:ext cx="5943600" cy="1738630"/>
+                      <a:ext cx="5943600" cy="1834515"/>
                     </a:xfrm>
                     <a:prstGeom prst="rect">
                       <a:avLst/>
@@ -4680,54 +4073,11 @@
         </w:drawing>
       </w:r>
     </w:p>
-    <w:p>
-      <w:pPr>
-        <w:rPr>
-          <w:b/>
-          <w:bCs/>
-        </w:rPr>
-      </w:pPr>
-    </w:p>
-    <w:p>
-      <w:pPr>
-        <w:rPr>
-          <w:b/>
-          <w:bCs/>
-        </w:rPr>
-      </w:pPr>
-    </w:p>
-    <w:p>
-      <w:pPr>
-        <w:rPr>
-          <w:b/>
-          <w:bCs/>
-        </w:rPr>
-      </w:pPr>
-    </w:p>
-    <w:p>
-      <w:pPr>
-        <w:rPr>
-          <w:b/>
-          <w:bCs/>
-        </w:rPr>
-      </w:pPr>
-    </w:p>
-    <w:p>
-      <w:pPr>
-        <w:rPr>
-          <w:b/>
-          <w:bCs/>
-        </w:rPr>
-      </w:pPr>
-    </w:p>
-    <w:p>
-      <w:pPr>
-        <w:rPr>
-          <w:b/>
-          <w:bCs/>
-        </w:rPr>
-      </w:pPr>
-    </w:p>
+    <w:p/>
+    <w:p/>
+    <w:p/>
+    <w:p/>
+    <w:p/>
     <w:p>
       <w:pPr>
         <w:rPr>
@@ -4741,27 +4091,21 @@
           <w:bCs/>
         </w:rPr>
         <w:lastRenderedPageBreak/>
-        <w:t>Adding only Assignment3 folder</w:t>
-      </w:r>
-    </w:p>
-    <w:p>
-      <w:pPr>
-        <w:rPr>
-          <w:b/>
-          <w:bCs/>
-        </w:rPr>
-      </w:pPr>
-      <w:r>
-        <w:rPr>
-          <w:b/>
-          <w:bCs/>
-          <w:noProof/>
-        </w:rPr>
+        <w:t>Pushing the Changes</w:t>
+      </w:r>
+    </w:p>
+    <w:p>
+      <w:r>
+        <w:t>git push origin main</w:t>
+      </w:r>
+    </w:p>
+    <w:p>
+      <w:r>
         <w:drawing>
-          <wp:inline distT="0" distB="0" distL="0" distR="0" wp14:anchorId="6B740A29" wp14:editId="5B5AFD70">
-            <wp:extent cx="5943600" cy="1713865"/>
-            <wp:effectExtent l="0" t="0" r="0" b="635"/>
-            <wp:docPr id="1932487648" name="Picture 1"/>
+          <wp:inline distT="0" distB="0" distL="0" distR="0" wp14:anchorId="6D510747" wp14:editId="68D002FC">
+            <wp:extent cx="5943600" cy="2466340"/>
+            <wp:effectExtent l="0" t="0" r="0" b="0"/>
+            <wp:docPr id="28719825" name="Picture 1"/>
             <wp:cNvGraphicFramePr>
               <a:graphicFrameLocks xmlns:a="http://schemas.openxmlformats.org/drawingml/2006/main" noChangeAspect="1"/>
             </wp:cNvGraphicFramePr>
@@ -4769,7 +4113,7 @@
               <a:graphicData uri="http://schemas.openxmlformats.org/drawingml/2006/picture">
                 <pic:pic xmlns:pic="http://schemas.openxmlformats.org/drawingml/2006/picture">
                   <pic:nvPicPr>
-                    <pic:cNvPr id="1932487648" name=""/>
+                    <pic:cNvPr id="28719825" name=""/>
                     <pic:cNvPicPr/>
                   </pic:nvPicPr>
                   <pic:blipFill>
@@ -4781,7 +4125,7 @@
                   <pic:spPr>
                     <a:xfrm>
                       <a:off x="0" y="0"/>
-                      <a:ext cx="5943600" cy="1713865"/>
+                      <a:ext cx="5943600" cy="2466340"/>
                     </a:xfrm>
                     <a:prstGeom prst="rect">
                       <a:avLst/>
@@ -4794,40 +4138,39 @@
         </w:drawing>
       </w:r>
     </w:p>
-    <w:p>
-      <w:pPr>
-        <w:rPr>
-          <w:b/>
-          <w:bCs/>
-        </w:rPr>
-      </w:pPr>
-    </w:p>
-    <w:p>
-      <w:pPr>
-        <w:rPr>
-          <w:b/>
-          <w:bCs/>
-        </w:rPr>
-      </w:pPr>
-      <w:r>
-        <w:rPr>
-          <w:b/>
-          <w:bCs/>
-          <w:noProof/>
-        </w:rPr>
-        <w:t>Commit Changes</w:t>
-      </w:r>
-    </w:p>
-    <w:p>
-      <w:r>
-        <w:rPr>
-          <w:noProof/>
+    <w:p/>
+    <w:p>
+      <w:pPr>
+        <w:rPr>
+          <w:b/>
+          <w:bCs/>
+        </w:rPr>
+      </w:pPr>
+      <w:r>
+        <w:rPr>
+          <w:b/>
+          <w:bCs/>
+        </w:rPr>
+        <w:t>Checking Status</w:t>
+      </w:r>
+    </w:p>
+    <w:p>
+      <w:pPr>
+        <w:rPr>
+          <w:b/>
+          <w:bCs/>
+        </w:rPr>
+      </w:pPr>
+      <w:r>
+        <w:rPr>
+          <w:b/>
+          <w:bCs/>
         </w:rPr>
         <w:drawing>
-          <wp:inline distT="0" distB="0" distL="0" distR="0" wp14:anchorId="52F02F94" wp14:editId="7EA30FC7">
-            <wp:extent cx="5943600" cy="2451100"/>
-            <wp:effectExtent l="0" t="0" r="0" b="6350"/>
-            <wp:docPr id="1365039359" name="Picture 1"/>
+          <wp:inline distT="0" distB="0" distL="0" distR="0" wp14:anchorId="5790554C" wp14:editId="7BF48354">
+            <wp:extent cx="5943600" cy="2776855"/>
+            <wp:effectExtent l="0" t="0" r="0" b="4445"/>
+            <wp:docPr id="1676313249" name="Picture 1"/>
             <wp:cNvGraphicFramePr>
               <a:graphicFrameLocks xmlns:a="http://schemas.openxmlformats.org/drawingml/2006/main" noChangeAspect="1"/>
             </wp:cNvGraphicFramePr>
@@ -4835,7 +4178,7 @@
               <a:graphicData uri="http://schemas.openxmlformats.org/drawingml/2006/picture">
                 <pic:pic xmlns:pic="http://schemas.openxmlformats.org/drawingml/2006/picture">
                   <pic:nvPicPr>
-                    <pic:cNvPr id="1365039359" name=""/>
+                    <pic:cNvPr id="1676313249" name=""/>
                     <pic:cNvPicPr/>
                   </pic:nvPicPr>
                   <pic:blipFill>
@@ -4847,7 +4190,7 @@
                   <pic:spPr>
                     <a:xfrm>
                       <a:off x="0" y="0"/>
-                      <a:ext cx="5943600" cy="2451100"/>
+                      <a:ext cx="5943600" cy="2776855"/>
                     </a:xfrm>
                     <a:prstGeom prst="rect">
                       <a:avLst/>
@@ -4860,15 +4203,38 @@
         </w:drawing>
       </w:r>
     </w:p>
-    <w:p/>
-    <w:p/>
-    <w:p/>
-    <w:p/>
-    <w:p/>
-    <w:p/>
-    <w:p/>
-    <w:p/>
-    <w:p/>
+    <w:p>
+      <w:pPr>
+        <w:rPr>
+          <w:b/>
+          <w:bCs/>
+        </w:rPr>
+      </w:pPr>
+    </w:p>
+    <w:p>
+      <w:pPr>
+        <w:rPr>
+          <w:b/>
+          <w:bCs/>
+        </w:rPr>
+      </w:pPr>
+    </w:p>
+    <w:p>
+      <w:pPr>
+        <w:rPr>
+          <w:b/>
+          <w:bCs/>
+        </w:rPr>
+      </w:pPr>
+    </w:p>
+    <w:p>
+      <w:pPr>
+        <w:rPr>
+          <w:b/>
+          <w:bCs/>
+        </w:rPr>
+      </w:pPr>
+    </w:p>
     <w:p>
       <w:pPr>
         <w:rPr>
@@ -4882,24 +4248,37 @@
           <w:bCs/>
         </w:rPr>
         <w:lastRenderedPageBreak/>
-        <w:t>Pushing the Changes</w:t>
-      </w:r>
-    </w:p>
-    <w:p>
-      <w:r>
-        <w:t>git push origin main</w:t>
-      </w:r>
-    </w:p>
-    <w:p>
-      <w:r>
-        <w:rPr>
-          <w:noProof/>
-        </w:rPr>
+        <w:t>In Git</w:t>
+      </w:r>
+      <w:r>
+        <w:rPr>
+          <w:b/>
+          <w:bCs/>
+        </w:rPr>
+        <w:t>-</w:t>
+      </w:r>
+      <w:r>
+        <w:rPr>
+          <w:b/>
+          <w:bCs/>
+        </w:rPr>
+        <w:t xml:space="preserve">Hub </w:t>
+      </w:r>
+      <w:r>
+        <w:rPr>
+          <w:b/>
+          <w:bCs/>
+        </w:rPr>
+        <w:t>repo page</w:t>
+      </w:r>
+    </w:p>
+    <w:p>
+      <w:r>
         <w:drawing>
-          <wp:inline distT="0" distB="0" distL="0" distR="0" wp14:anchorId="1E2D2B5E" wp14:editId="18277DCE">
-            <wp:extent cx="5943600" cy="3058795"/>
-            <wp:effectExtent l="0" t="0" r="0" b="8255"/>
-            <wp:docPr id="1961854981" name="Picture 1"/>
+          <wp:inline distT="0" distB="0" distL="0" distR="0" wp14:anchorId="2D18AC17" wp14:editId="73A5ED33">
+            <wp:extent cx="5943600" cy="2500630"/>
+            <wp:effectExtent l="0" t="0" r="0" b="0"/>
+            <wp:docPr id="2105967800" name="Picture 1"/>
             <wp:cNvGraphicFramePr>
               <a:graphicFrameLocks xmlns:a="http://schemas.openxmlformats.org/drawingml/2006/main" noChangeAspect="1"/>
             </wp:cNvGraphicFramePr>
@@ -4907,7 +4286,7 @@
               <a:graphicData uri="http://schemas.openxmlformats.org/drawingml/2006/picture">
                 <pic:pic xmlns:pic="http://schemas.openxmlformats.org/drawingml/2006/picture">
                   <pic:nvPicPr>
-                    <pic:cNvPr id="1961854981" name=""/>
+                    <pic:cNvPr id="2105967800" name=""/>
                     <pic:cNvPicPr/>
                   </pic:nvPicPr>
                   <pic:blipFill>
@@ -4919,7 +4298,7 @@
                   <pic:spPr>
                     <a:xfrm>
                       <a:off x="0" y="0"/>
-                      <a:ext cx="5943600" cy="3058795"/>
+                      <a:ext cx="5943600" cy="2500630"/>
                     </a:xfrm>
                     <a:prstGeom prst="rect">
                       <a:avLst/>
@@ -4933,201 +4312,8 @@
       </w:r>
     </w:p>
     <w:p/>
-    <w:p>
-      <w:pPr>
-        <w:rPr>
-          <w:b/>
-          <w:bCs/>
-        </w:rPr>
-      </w:pPr>
-      <w:r>
-        <w:rPr>
-          <w:b/>
-          <w:bCs/>
-        </w:rPr>
-        <w:t>Checking Status</w:t>
-      </w:r>
-    </w:p>
-    <w:p>
-      <w:pPr>
-        <w:rPr>
-          <w:b/>
-          <w:bCs/>
-        </w:rPr>
-      </w:pPr>
-      <w:r>
-        <w:rPr>
-          <w:b/>
-          <w:bCs/>
-          <w:noProof/>
-        </w:rPr>
-        <w:drawing>
-          <wp:inline distT="0" distB="0" distL="0" distR="0" wp14:anchorId="75AF19A8" wp14:editId="449B19D5">
-            <wp:extent cx="5943600" cy="3523615"/>
-            <wp:effectExtent l="0" t="0" r="0" b="635"/>
-            <wp:docPr id="891159789" name="Picture 1"/>
-            <wp:cNvGraphicFramePr>
-              <a:graphicFrameLocks xmlns:a="http://schemas.openxmlformats.org/drawingml/2006/main" noChangeAspect="1"/>
-            </wp:cNvGraphicFramePr>
-            <a:graphic xmlns:a="http://schemas.openxmlformats.org/drawingml/2006/main">
-              <a:graphicData uri="http://schemas.openxmlformats.org/drawingml/2006/picture">
-                <pic:pic xmlns:pic="http://schemas.openxmlformats.org/drawingml/2006/picture">
-                  <pic:nvPicPr>
-                    <pic:cNvPr id="891159789" name=""/>
-                    <pic:cNvPicPr/>
-                  </pic:nvPicPr>
-                  <pic:blipFill>
-                    <a:blip r:embed="rId30"/>
-                    <a:stretch>
-                      <a:fillRect/>
-                    </a:stretch>
-                  </pic:blipFill>
-                  <pic:spPr>
-                    <a:xfrm>
-                      <a:off x="0" y="0"/>
-                      <a:ext cx="5943600" cy="3523615"/>
-                    </a:xfrm>
-                    <a:prstGeom prst="rect">
-                      <a:avLst/>
-                    </a:prstGeom>
-                  </pic:spPr>
-                </pic:pic>
-              </a:graphicData>
-            </a:graphic>
-          </wp:inline>
-        </w:drawing>
-      </w:r>
-    </w:p>
-    <w:p>
-      <w:pPr>
-        <w:rPr>
-          <w:b/>
-          <w:bCs/>
-        </w:rPr>
-      </w:pPr>
-    </w:p>
-    <w:p>
-      <w:pPr>
-        <w:rPr>
-          <w:b/>
-          <w:bCs/>
-        </w:rPr>
-      </w:pPr>
-      <w:r>
-        <w:rPr>
-          <w:b/>
-          <w:bCs/>
-        </w:rPr>
-        <w:t>In Git</w:t>
-      </w:r>
-      <w:r>
-        <w:rPr>
-          <w:b/>
-          <w:bCs/>
-        </w:rPr>
-        <w:t>-</w:t>
-      </w:r>
-      <w:r>
-        <w:rPr>
-          <w:b/>
-          <w:bCs/>
-        </w:rPr>
-        <w:t xml:space="preserve">Hub </w:t>
-      </w:r>
-      <w:r>
-        <w:rPr>
-          <w:b/>
-          <w:bCs/>
-        </w:rPr>
-        <w:t>repo page</w:t>
-      </w:r>
-    </w:p>
-    <w:p>
-      <w:r>
-        <w:rPr>
-          <w:noProof/>
-        </w:rPr>
-        <w:drawing>
-          <wp:inline distT="0" distB="0" distL="0" distR="0" wp14:anchorId="1298038E" wp14:editId="46AE3C54">
-            <wp:extent cx="5943600" cy="3337560"/>
-            <wp:effectExtent l="0" t="0" r="0" b="0"/>
-            <wp:docPr id="956193771" name="Picture 1"/>
-            <wp:cNvGraphicFramePr>
-              <a:graphicFrameLocks xmlns:a="http://schemas.openxmlformats.org/drawingml/2006/main" noChangeAspect="1"/>
-            </wp:cNvGraphicFramePr>
-            <a:graphic xmlns:a="http://schemas.openxmlformats.org/drawingml/2006/main">
-              <a:graphicData uri="http://schemas.openxmlformats.org/drawingml/2006/picture">
-                <pic:pic xmlns:pic="http://schemas.openxmlformats.org/drawingml/2006/picture">
-                  <pic:nvPicPr>
-                    <pic:cNvPr id="956193771" name=""/>
-                    <pic:cNvPicPr/>
-                  </pic:nvPicPr>
-                  <pic:blipFill>
-                    <a:blip r:embed="rId31"/>
-                    <a:stretch>
-                      <a:fillRect/>
-                    </a:stretch>
-                  </pic:blipFill>
-                  <pic:spPr>
-                    <a:xfrm>
-                      <a:off x="0" y="0"/>
-                      <a:ext cx="5943600" cy="3337560"/>
-                    </a:xfrm>
-                    <a:prstGeom prst="rect">
-                      <a:avLst/>
-                    </a:prstGeom>
-                  </pic:spPr>
-                </pic:pic>
-              </a:graphicData>
-            </a:graphic>
-          </wp:inline>
-        </w:drawing>
-      </w:r>
-    </w:p>
     <w:p/>
     <w:p/>
-    <w:p>
-      <w:r>
-        <w:rPr>
-          <w:noProof/>
-        </w:rPr>
-        <w:drawing>
-          <wp:inline distT="0" distB="0" distL="0" distR="0" wp14:anchorId="13AEC4CA" wp14:editId="0C9E2FCF">
-            <wp:extent cx="5943600" cy="2606040"/>
-            <wp:effectExtent l="0" t="0" r="0" b="3810"/>
-            <wp:docPr id="8205319" name="Picture 1"/>
-            <wp:cNvGraphicFramePr>
-              <a:graphicFrameLocks xmlns:a="http://schemas.openxmlformats.org/drawingml/2006/main" noChangeAspect="1"/>
-            </wp:cNvGraphicFramePr>
-            <a:graphic xmlns:a="http://schemas.openxmlformats.org/drawingml/2006/main">
-              <a:graphicData uri="http://schemas.openxmlformats.org/drawingml/2006/picture">
-                <pic:pic xmlns:pic="http://schemas.openxmlformats.org/drawingml/2006/picture">
-                  <pic:nvPicPr>
-                    <pic:cNvPr id="8205319" name=""/>
-                    <pic:cNvPicPr/>
-                  </pic:nvPicPr>
-                  <pic:blipFill>
-                    <a:blip r:embed="rId32"/>
-                    <a:stretch>
-                      <a:fillRect/>
-                    </a:stretch>
-                  </pic:blipFill>
-                  <pic:spPr>
-                    <a:xfrm>
-                      <a:off x="0" y="0"/>
-                      <a:ext cx="5943600" cy="2606040"/>
-                    </a:xfrm>
-                    <a:prstGeom prst="rect">
-                      <a:avLst/>
-                    </a:prstGeom>
-                  </pic:spPr>
-                </pic:pic>
-              </a:graphicData>
-            </a:graphic>
-          </wp:inline>
-        </w:drawing>
-      </w:r>
-    </w:p>
     <w:p/>
     <w:p/>
     <w:p/>

</xml_diff>